<commit_message>
docs: remove duplicate page headings and obsolete troubleshooting sections
</commit_message>
<xml_diff>
--- a/dist/documentation/export-only/manual.docx
+++ b/dist/documentation/export-only/manual.docx
@@ -6346,45 +6346,6 @@
         <w:pStyle w:val="Heading2"/>
       </w:pPr>
       <w:r>
-        <w:t>Коммит не создал сборку</w:t>
-      </w:r>
-    </w:p>
-    <w:p>
-      <w:r>
-        <w:t>Сверьте ветку и фильтр paths. Документация не входит в desktop-фильтр. Для artifact используйте Run workflow; для постоянного Release — уникальный тег нужного префикса.</w:t>
-      </w:r>
-    </w:p>
-    <w:p>
-      <w:pPr>
-        <w:pStyle w:val="Heading2"/>
-      </w:pPr>
-      <w:r>
-        <w:t>Исчезла ссылка на artifact</w:t>
-      </w:r>
-    </w:p>
-    <w:p>
-      <w:r>
-        <w:t>Artifacts хранятся 14 дней по текущему workflow. Постоянный выпуск распространяйте через Releases.</w:t>
-      </w:r>
-    </w:p>
-    <w:p>
-      <w:pPr>
-        <w:pStyle w:val="Heading2"/>
-      </w:pPr>
-      <w:r>
-        <w:t>Starlight не стартует на WSL-пути</w:t>
-      </w:r>
-    </w:p>
-    <w:p>
-      <w:r>
-        <w:t>Не используйте Windows Node для UNC-пути Linux checkout. Запустите Linux Node внутри WSL или нативный Windows checkout. Временная копия требует обновления после правок источников.</w:t>
-      </w:r>
-    </w:p>
-    <w:p>
-      <w:pPr>
-        <w:pStyle w:val="Heading2"/>
-      </w:pPr>
-      <w:r>
         <w:t>После установки цифры мониторинга другие</w:t>
       </w:r>
     </w:p>

</xml_diff>